<commit_message>
DEPLOY: BUG-05 fix + CalendarGrid cleanup + Doku-Update (13.04.2026)
- server.ts: app.options Wildcard-Handler entfernt (CORS via Middleware, path-to-regexp v8 inkompatibel)
- CalendarGrid.tsx: 'Alle Buchungen löschen'-Button entfernt
- Docs: AI.md, PRD.md, decisions/log.md, Handbücher aktualisiert
- Neue Doku-Versionen: benutzerdokumentation_v1.3/v1.4, deployment_handbuch, features/

Co-Authored-By: Claude Sonnet 4.6 <noreply@anthropic.com>
</commit_message>
<xml_diff>
--- a/docs/deployment_handbuch_v1.0.docx
+++ b/docs/deployment_handbuch_v1.0.docx
@@ -4898,7 +4898,7 @@
           <w:sz w:val="26"/>
           <w:szCs w:val="26"/>
         </w:rPr>
-        <w:t xml:space="preserve">4.x Hinweis: PI Dashboard Tab – localStorage</w:t>
+        <w:t xml:space="preserve">4.x Hinweis: PI Dashboard Tab – SP-in-Jira-Persistenz (ab v1.3)</w:t>
       </w:r>
     </w:p>
     <w:p>
@@ -4912,7 +4912,7 @@
           <w:sz w:val="20"/>
           <w:szCs w:val="20"/>
         </w:rPr>
-        <w:t xml:space="preserve">Der PI Dashboard Tab speichert die manuell erfassten „SP in Jira“-Werte lokal im Browser (localStorage). Diese Werte werden – im Gegensatz zu Buchungen und Einstellungen – nicht über den Server synchronisiert.</w:t>
+        <w:t xml:space="preserve">Ab App-Version 1.3 werden die manuell erfassten „SP in Jira“-Werte im Server-State (AppData) gespeichert und via Socket.io synchronisiert. Sie sind Teil des JSON-Backups.</w:t>
       </w:r>
     </w:p>
     <w:tbl>
@@ -5050,7 +5050,7 @@
                 <w:sz w:val="20"/>
                 <w:szCs w:val="20"/>
               </w:rPr>
-              <w:t xml:space="preserve">Browser localStorage (Key: pi-dashboard-sp-jira-v1)</w:t>
+              <w:t xml:space="preserve">Server-State (AppData.piTeamTargets), JSON-File auf Backend</w:t>
             </w:r>
           </w:p>
         </w:tc>
@@ -5110,7 +5110,7 @@
                 <w:sz w:val="20"/>
                 <w:szCs w:val="20"/>
               </w:rPr>
-              <w:t xml:space="preserve">Geräte- und browserspezifisch – nicht zwischen Benutzern synchronisiert</w:t>
+              <w:t xml:space="preserve">Alle verbundenen Benutzer sehen dieselben Werte (synchronisiert)</w:t>
             </w:r>
           </w:p>
         </w:tc>
@@ -5170,7 +5170,7 @@
                 <w:sz w:val="20"/>
                 <w:szCs w:val="20"/>
               </w:rPr>
-              <w:t xml:space="preserve">Bei Browser-Cache-Löschung gehen die Werte verloren</w:t>
+              <w:t xml:space="preserve">Nur bei Server-Neustart ohne vorheriges Backup</w:t>
             </w:r>
           </w:p>
         </w:tc>
@@ -5201,7 +5201,7 @@
                 <w:sz w:val="20"/>
                 <w:szCs w:val="20"/>
               </w:rPr>
-              <w:t xml:space="preserve">Empfehlung</w:t>
+              <w:t xml:space="preserve">Backup</w:t>
             </w:r>
           </w:p>
         </w:tc>
@@ -5230,7 +5230,7 @@
                 <w:sz w:val="20"/>
                 <w:szCs w:val="20"/>
               </w:rPr>
-              <w:t xml:space="preserve">Werte zusätzlich in einem gemeinsamen Dokument (Excel, Confluence) festhalten</w:t>
+              <w:t xml:space="preserve">Im JSON-Backup enthalten (Feld piTeamTargets) – bei Restore wiederhergestellt</w:t>
             </w:r>
           </w:p>
         </w:tc>
@@ -5282,7 +5282,7 @@
                 <w:sz w:val="20"/>
                 <w:szCs w:val="20"/>
               </w:rPr>
-              <w:t xml:space="preserve">Wichtig: Alle anderen App-Daten (Buchungen, Einstellungen, PIs, Mitarbeiter) werden über den Server synchronisiert und sind für alle verbundenen Benutzer sichtbar. Nur die SP-in-Jira-Werte im PI Dashboard sind lokal.</w:t>
+              <w:t xml:space="preserve">Wichtig: Alle App-Daten inkl. SP-in-Jira-Werte werden über den Server synchronisiert. Regelmässige JSON-Backups (Einstellungen → Backup/Restore) schützen vor Datenverlust bei Server-Neustart.</w:t>
             </w:r>
           </w:p>
         </w:tc>

</xml_diff>